<commit_message>
actualizacion: se agrego la portada al documento
</commit_message>
<xml_diff>
--- a/Act1_suarez/Nuevo Documento de Microsoft Word.docx
+++ b/Act1_suarez/Nuevo Documento de Microsoft Word.docx
@@ -3,29 +3,920 @@
 <w:document xmlns:wpc="http://schemas.microsoft.com/office/word/2010/wordprocessingCanvas" xmlns:cx="http://schemas.microsoft.com/office/drawing/2014/chartex" xmlns:cx1="http://schemas.microsoft.com/office/drawing/2015/9/8/chartex" xmlns:cx2="http://schemas.microsoft.com/office/drawing/2015/10/21/chartex" xmlns:cx3="http://schemas.microsoft.com/office/drawing/2016/5/9/chartex" xmlns:cx4="http://schemas.microsoft.com/office/drawing/2016/5/10/chartex" xmlns:cx5="http://schemas.microsoft.com/office/drawing/2016/5/11/chartex" xmlns:cx6="http://schemas.microsoft.com/office/drawing/2016/5/12/chartex" xmlns:cx7="http://schemas.microsoft.com/office/drawing/2016/5/13/chartex" xmlns:cx8="http://schemas.microsoft.com/office/drawing/2016/5/14/chartex" xmlns:mc="http://schemas.openxmlformats.org/markup-compatibility/2006" xmlns:aink="http://schemas.microsoft.com/office/drawing/2016/ink" xmlns:am3d="http://schemas.microsoft.com/office/drawing/2017/model3d" xmlns:o="urn:schemas-microsoft-com:office:office" xmlns:oel="http://schemas.microsoft.com/office/2019/extlst" xmlns:r="http://schemas.openxmlformats.org/officeDocument/2006/relationships" xmlns:m="http://schemas.openxmlformats.org/officeDocument/2006/math" xmlns:v="urn:schemas-microsoft-com:vml" xmlns:wp14="http://schemas.microsoft.com/office/word/2010/wordprocessingDrawing" xmlns:wp="http://schemas.openxmlformats.org/drawingml/2006/wordprocessingDrawing" xmlns:w10="urn:schemas-microsoft-com:office:word" xmlns:w="http://schemas.openxmlformats.org/wordprocessingml/2006/main" xmlns:w14="http://schemas.microsoft.com/office/word/2010/wordml" xmlns:w15="http://schemas.microsoft.com/office/word/2012/wordml" xmlns:w16cex="http://schemas.microsoft.com/office/word/2018/wordml/cex" xmlns:w16cid="http://schemas.microsoft.com/office/word/2016/wordml/cid" xmlns:w16="http://schemas.microsoft.com/office/word/2018/wordml" xmlns:w16sdtdh="http://schemas.microsoft.com/office/word/2020/wordml/sdtdatahash" xmlns:w16se="http://schemas.microsoft.com/office/word/2015/wordml/symex" xmlns:wpg="http://schemas.microsoft.com/office/word/2010/wordprocessingGroup" xmlns:wpi="http://schemas.microsoft.com/office/word/2010/wordprocessingInk" xmlns:wne="http://schemas.microsoft.com/office/word/2006/wordml" xmlns:wps="http://schemas.microsoft.com/office/word/2010/wordprocessingShape" mc:Ignorable="w14 w15 w16se w16cid w16 w16cex w16sdtdh wp14">
   <w:body>
     <w:p>
+      <w:pPr>
+        <w:ind w:left="3385"/>
+        <w:rPr>
+          <w:sz w:val="20"/>
+        </w:rPr>
+      </w:pPr>
       <w:r>
         <w:rPr>
           <w:noProof/>
+          <w:sz w:val="20"/>
+        </w:rPr>
+        <mc:AlternateContent>
+          <mc:Choice Requires="wpg">
+            <w:drawing>
+              <wp:anchor distT="0" distB="0" distL="0" distR="0" simplePos="0" relativeHeight="251659264" behindDoc="1" locked="0" layoutInCell="1" allowOverlap="1" wp14:anchorId="54E4C535" wp14:editId="676E75A4">
+                <wp:simplePos x="0" y="0"/>
+                <wp:positionH relativeFrom="page">
+                  <wp:posOffset>217170</wp:posOffset>
+                </wp:positionH>
+                <wp:positionV relativeFrom="page">
+                  <wp:posOffset>304800</wp:posOffset>
+                </wp:positionV>
+                <wp:extent cx="7251700" cy="9450705"/>
+                <wp:effectExtent l="0" t="0" r="0" b="0"/>
+                <wp:wrapNone/>
+                <wp:docPr id="4" name="Group 1"/>
+                <wp:cNvGraphicFramePr>
+                  <a:graphicFrameLocks xmlns:a="http://schemas.openxmlformats.org/drawingml/2006/main"/>
+                </wp:cNvGraphicFramePr>
+                <a:graphic xmlns:a="http://schemas.openxmlformats.org/drawingml/2006/main">
+                  <a:graphicData uri="http://schemas.microsoft.com/office/word/2010/wordprocessingGroup">
+                    <wpg:wgp>
+                      <wpg:cNvGrpSpPr>
+                        <a:grpSpLocks/>
+                      </wpg:cNvGrpSpPr>
+                      <wpg:grpSpPr>
+                        <a:xfrm>
+                          <a:off x="0" y="0"/>
+                          <a:ext cx="7251700" cy="9450705"/>
+                          <a:chOff x="0" y="0"/>
+                          <a:chExt cx="7251700" cy="9450705"/>
+                        </a:xfrm>
+                      </wpg:grpSpPr>
+                      <pic:pic xmlns:pic="http://schemas.openxmlformats.org/drawingml/2006/picture">
+                        <pic:nvPicPr>
+                          <pic:cNvPr id="5" name="Image 2" descr="Premium business flyer template Vectors - Download Free High-Quality  Vectors | Magnific (formerly Freepik)"/>
+                          <pic:cNvPicPr/>
+                        </pic:nvPicPr>
+                        <pic:blipFill>
+                          <a:blip r:embed="rId4" cstate="print"/>
+                          <a:stretch>
+                            <a:fillRect/>
+                          </a:stretch>
+                        </pic:blipFill>
+                        <pic:spPr>
+                          <a:xfrm>
+                            <a:off x="0" y="63"/>
+                            <a:ext cx="853440" cy="9448165"/>
+                          </a:xfrm>
+                          <a:prstGeom prst="rect">
+                            <a:avLst/>
+                          </a:prstGeom>
+                        </pic:spPr>
+                      </pic:pic>
+                      <wps:wsp>
+                        <wps:cNvPr id="6" name="Graphic 3"/>
+                        <wps:cNvSpPr/>
+                        <wps:spPr>
+                          <a:xfrm>
+                            <a:off x="87630" y="0"/>
+                            <a:ext cx="30480" cy="30480"/>
+                          </a:xfrm>
+                          <a:custGeom>
+                            <a:avLst/>
+                            <a:gdLst/>
+                            <a:ahLst/>
+                            <a:cxnLst/>
+                            <a:rect l="l" t="t" r="r" b="b"/>
+                            <a:pathLst>
+                              <a:path w="30480" h="30480">
+                                <a:moveTo>
+                                  <a:pt x="30480" y="0"/>
+                                </a:moveTo>
+                                <a:lnTo>
+                                  <a:pt x="18288" y="0"/>
+                                </a:lnTo>
+                                <a:lnTo>
+                                  <a:pt x="0" y="0"/>
+                                </a:lnTo>
+                                <a:lnTo>
+                                  <a:pt x="0" y="18288"/>
+                                </a:lnTo>
+                                <a:lnTo>
+                                  <a:pt x="0" y="30480"/>
+                                </a:lnTo>
+                                <a:lnTo>
+                                  <a:pt x="18288" y="30480"/>
+                                </a:lnTo>
+                                <a:lnTo>
+                                  <a:pt x="18288" y="18288"/>
+                                </a:lnTo>
+                                <a:lnTo>
+                                  <a:pt x="30480" y="18288"/>
+                                </a:lnTo>
+                                <a:lnTo>
+                                  <a:pt x="30480" y="0"/>
+                                </a:lnTo>
+                                <a:close/>
+                              </a:path>
+                            </a:pathLst>
+                          </a:custGeom>
+                          <a:solidFill>
+                            <a:srgbClr val="000000"/>
+                          </a:solidFill>
+                        </wps:spPr>
+                        <wps:bodyPr wrap="square" lIns="0" tIns="0" rIns="0" bIns="0" rtlCol="0">
+                          <a:prstTxWarp prst="textNoShape">
+                            <a:avLst/>
+                          </a:prstTxWarp>
+                          <a:noAutofit/>
+                        </wps:bodyPr>
+                      </wps:wsp>
+                      <wps:wsp>
+                        <wps:cNvPr id="7" name="Graphic 4"/>
+                        <wps:cNvSpPr/>
+                        <wps:spPr>
+                          <a:xfrm>
+                            <a:off x="105918" y="18287"/>
+                            <a:ext cx="12700" cy="12700"/>
+                          </a:xfrm>
+                          <a:custGeom>
+                            <a:avLst/>
+                            <a:gdLst/>
+                            <a:ahLst/>
+                            <a:cxnLst/>
+                            <a:rect l="l" t="t" r="r" b="b"/>
+                            <a:pathLst>
+                              <a:path w="12700" h="12700">
+                                <a:moveTo>
+                                  <a:pt x="12192" y="0"/>
+                                </a:moveTo>
+                                <a:lnTo>
+                                  <a:pt x="3048" y="0"/>
+                                </a:lnTo>
+                                <a:lnTo>
+                                  <a:pt x="0" y="0"/>
+                                </a:lnTo>
+                                <a:lnTo>
+                                  <a:pt x="0" y="3048"/>
+                                </a:lnTo>
+                                <a:lnTo>
+                                  <a:pt x="0" y="12192"/>
+                                </a:lnTo>
+                                <a:lnTo>
+                                  <a:pt x="3048" y="12192"/>
+                                </a:lnTo>
+                                <a:lnTo>
+                                  <a:pt x="3048" y="3048"/>
+                                </a:lnTo>
+                                <a:lnTo>
+                                  <a:pt x="12192" y="3048"/>
+                                </a:lnTo>
+                                <a:lnTo>
+                                  <a:pt x="12192" y="0"/>
+                                </a:lnTo>
+                                <a:close/>
+                              </a:path>
+                            </a:pathLst>
+                          </a:custGeom>
+                          <a:solidFill>
+                            <a:srgbClr val="FFFFFF"/>
+                          </a:solidFill>
+                        </wps:spPr>
+                        <wps:bodyPr wrap="square" lIns="0" tIns="0" rIns="0" bIns="0" rtlCol="0">
+                          <a:prstTxWarp prst="textNoShape">
+                            <a:avLst/>
+                          </a:prstTxWarp>
+                          <a:noAutofit/>
+                        </wps:bodyPr>
+                      </wps:wsp>
+                      <wps:wsp>
+                        <wps:cNvPr id="8" name="Graphic 5"/>
+                        <wps:cNvSpPr/>
+                        <wps:spPr>
+                          <a:xfrm>
+                            <a:off x="108966" y="0"/>
+                            <a:ext cx="7112634" cy="30480"/>
+                          </a:xfrm>
+                          <a:custGeom>
+                            <a:avLst/>
+                            <a:gdLst/>
+                            <a:ahLst/>
+                            <a:cxnLst/>
+                            <a:rect l="l" t="t" r="r" b="b"/>
+                            <a:pathLst>
+                              <a:path w="7112634" h="30480">
+                                <a:moveTo>
+                                  <a:pt x="9144" y="21336"/>
+                                </a:moveTo>
+                                <a:lnTo>
+                                  <a:pt x="0" y="21336"/>
+                                </a:lnTo>
+                                <a:lnTo>
+                                  <a:pt x="0" y="30480"/>
+                                </a:lnTo>
+                                <a:lnTo>
+                                  <a:pt x="9144" y="30480"/>
+                                </a:lnTo>
+                                <a:lnTo>
+                                  <a:pt x="9144" y="21336"/>
+                                </a:lnTo>
+                                <a:close/>
+                              </a:path>
+                              <a:path w="7112634" h="30480">
+                                <a:moveTo>
+                                  <a:pt x="7112241" y="0"/>
+                                </a:moveTo>
+                                <a:lnTo>
+                                  <a:pt x="9144" y="0"/>
+                                </a:lnTo>
+                                <a:lnTo>
+                                  <a:pt x="9144" y="18288"/>
+                                </a:lnTo>
+                                <a:lnTo>
+                                  <a:pt x="7112241" y="18288"/>
+                                </a:lnTo>
+                                <a:lnTo>
+                                  <a:pt x="7112241" y="0"/>
+                                </a:lnTo>
+                                <a:close/>
+                              </a:path>
+                            </a:pathLst>
+                          </a:custGeom>
+                          <a:solidFill>
+                            <a:srgbClr val="000000"/>
+                          </a:solidFill>
+                        </wps:spPr>
+                        <wps:bodyPr wrap="square" lIns="0" tIns="0" rIns="0" bIns="0" rtlCol="0">
+                          <a:prstTxWarp prst="textNoShape">
+                            <a:avLst/>
+                          </a:prstTxWarp>
+                          <a:noAutofit/>
+                        </wps:bodyPr>
+                      </wps:wsp>
+                      <wps:wsp>
+                        <wps:cNvPr id="9" name="Graphic 6"/>
+                        <wps:cNvSpPr/>
+                        <wps:spPr>
+                          <a:xfrm>
+                            <a:off x="118110" y="18288"/>
+                            <a:ext cx="7103109" cy="3175"/>
+                          </a:xfrm>
+                          <a:custGeom>
+                            <a:avLst/>
+                            <a:gdLst/>
+                            <a:ahLst/>
+                            <a:cxnLst/>
+                            <a:rect l="l" t="t" r="r" b="b"/>
+                            <a:pathLst>
+                              <a:path w="7103109" h="3175">
+                                <a:moveTo>
+                                  <a:pt x="7103109" y="0"/>
+                                </a:moveTo>
+                                <a:lnTo>
+                                  <a:pt x="0" y="0"/>
+                                </a:lnTo>
+                                <a:lnTo>
+                                  <a:pt x="0" y="3048"/>
+                                </a:lnTo>
+                                <a:lnTo>
+                                  <a:pt x="7103109" y="3048"/>
+                                </a:lnTo>
+                                <a:lnTo>
+                                  <a:pt x="7103109" y="0"/>
+                                </a:lnTo>
+                                <a:close/>
+                              </a:path>
+                            </a:pathLst>
+                          </a:custGeom>
+                          <a:solidFill>
+                            <a:srgbClr val="FFFFFF"/>
+                          </a:solidFill>
+                        </wps:spPr>
+                        <wps:bodyPr wrap="square" lIns="0" tIns="0" rIns="0" bIns="0" rtlCol="0">
+                          <a:prstTxWarp prst="textNoShape">
+                            <a:avLst/>
+                          </a:prstTxWarp>
+                          <a:noAutofit/>
+                        </wps:bodyPr>
+                      </wps:wsp>
+                      <wps:wsp>
+                        <wps:cNvPr id="10" name="Graphic 7"/>
+                        <wps:cNvSpPr/>
+                        <wps:spPr>
+                          <a:xfrm>
+                            <a:off x="87630" y="0"/>
+                            <a:ext cx="7164070" cy="9420225"/>
+                          </a:xfrm>
+                          <a:custGeom>
+                            <a:avLst/>
+                            <a:gdLst/>
+                            <a:ahLst/>
+                            <a:cxnLst/>
+                            <a:rect l="l" t="t" r="r" b="b"/>
+                            <a:pathLst>
+                              <a:path w="7164070" h="9420225">
+                                <a:moveTo>
+                                  <a:pt x="18288" y="30480"/>
+                                </a:moveTo>
+                                <a:lnTo>
+                                  <a:pt x="0" y="30480"/>
+                                </a:lnTo>
+                                <a:lnTo>
+                                  <a:pt x="0" y="9419844"/>
+                                </a:lnTo>
+                                <a:lnTo>
+                                  <a:pt x="18288" y="9419844"/>
+                                </a:lnTo>
+                                <a:lnTo>
+                                  <a:pt x="18288" y="30480"/>
+                                </a:lnTo>
+                                <a:close/>
+                              </a:path>
+                              <a:path w="7164070" h="9420225">
+                                <a:moveTo>
+                                  <a:pt x="7133577" y="21336"/>
+                                </a:moveTo>
+                                <a:lnTo>
+                                  <a:pt x="30480" y="21336"/>
+                                </a:lnTo>
+                                <a:lnTo>
+                                  <a:pt x="30480" y="30480"/>
+                                </a:lnTo>
+                                <a:lnTo>
+                                  <a:pt x="7133577" y="30480"/>
+                                </a:lnTo>
+                                <a:lnTo>
+                                  <a:pt x="7133577" y="21336"/>
+                                </a:lnTo>
+                                <a:close/>
+                              </a:path>
+                              <a:path w="7164070" h="9420225">
+                                <a:moveTo>
+                                  <a:pt x="7142734" y="21336"/>
+                                </a:moveTo>
+                                <a:lnTo>
+                                  <a:pt x="7133590" y="21336"/>
+                                </a:lnTo>
+                                <a:lnTo>
+                                  <a:pt x="7133590" y="30480"/>
+                                </a:lnTo>
+                                <a:lnTo>
+                                  <a:pt x="7142734" y="30480"/>
+                                </a:lnTo>
+                                <a:lnTo>
+                                  <a:pt x="7142734" y="21336"/>
+                                </a:lnTo>
+                                <a:close/>
+                              </a:path>
+                              <a:path w="7164070" h="9420225">
+                                <a:moveTo>
+                                  <a:pt x="7164070" y="0"/>
+                                </a:moveTo>
+                                <a:lnTo>
+                                  <a:pt x="7145782" y="0"/>
+                                </a:lnTo>
+                                <a:lnTo>
+                                  <a:pt x="7133590" y="0"/>
+                                </a:lnTo>
+                                <a:lnTo>
+                                  <a:pt x="7133590" y="18288"/>
+                                </a:lnTo>
+                                <a:lnTo>
+                                  <a:pt x="7145782" y="18288"/>
+                                </a:lnTo>
+                                <a:lnTo>
+                                  <a:pt x="7145782" y="30480"/>
+                                </a:lnTo>
+                                <a:lnTo>
+                                  <a:pt x="7164070" y="30480"/>
+                                </a:lnTo>
+                                <a:lnTo>
+                                  <a:pt x="7164070" y="18288"/>
+                                </a:lnTo>
+                                <a:lnTo>
+                                  <a:pt x="7164070" y="0"/>
+                                </a:lnTo>
+                                <a:close/>
+                              </a:path>
+                            </a:pathLst>
+                          </a:custGeom>
+                          <a:solidFill>
+                            <a:srgbClr val="000000"/>
+                          </a:solidFill>
+                        </wps:spPr>
+                        <wps:bodyPr wrap="square" lIns="0" tIns="0" rIns="0" bIns="0" rtlCol="0">
+                          <a:prstTxWarp prst="textNoShape">
+                            <a:avLst/>
+                          </a:prstTxWarp>
+                          <a:noAutofit/>
+                        </wps:bodyPr>
+                      </wps:wsp>
+                      <wps:wsp>
+                        <wps:cNvPr id="11" name="Graphic 8"/>
+                        <wps:cNvSpPr/>
+                        <wps:spPr>
+                          <a:xfrm>
+                            <a:off x="105918" y="30480"/>
+                            <a:ext cx="3175" cy="9389745"/>
+                          </a:xfrm>
+                          <a:custGeom>
+                            <a:avLst/>
+                            <a:gdLst/>
+                            <a:ahLst/>
+                            <a:cxnLst/>
+                            <a:rect l="l" t="t" r="r" b="b"/>
+                            <a:pathLst>
+                              <a:path w="3175" h="9389745">
+                                <a:moveTo>
+                                  <a:pt x="3047" y="0"/>
+                                </a:moveTo>
+                                <a:lnTo>
+                                  <a:pt x="0" y="0"/>
+                                </a:lnTo>
+                                <a:lnTo>
+                                  <a:pt x="0" y="9389364"/>
+                                </a:lnTo>
+                                <a:lnTo>
+                                  <a:pt x="3047" y="9389364"/>
+                                </a:lnTo>
+                                <a:lnTo>
+                                  <a:pt x="3047" y="0"/>
+                                </a:lnTo>
+                                <a:close/>
+                              </a:path>
+                            </a:pathLst>
+                          </a:custGeom>
+                          <a:solidFill>
+                            <a:srgbClr val="FFFFFF"/>
+                          </a:solidFill>
+                        </wps:spPr>
+                        <wps:bodyPr wrap="square" lIns="0" tIns="0" rIns="0" bIns="0" rtlCol="0">
+                          <a:prstTxWarp prst="textNoShape">
+                            <a:avLst/>
+                          </a:prstTxWarp>
+                          <a:noAutofit/>
+                        </wps:bodyPr>
+                      </wps:wsp>
+                      <wps:wsp>
+                        <wps:cNvPr id="12" name="Graphic 9"/>
+                        <wps:cNvSpPr/>
+                        <wps:spPr>
+                          <a:xfrm>
+                            <a:off x="87630" y="30479"/>
+                            <a:ext cx="7164070" cy="9420225"/>
+                          </a:xfrm>
+                          <a:custGeom>
+                            <a:avLst/>
+                            <a:gdLst/>
+                            <a:ahLst/>
+                            <a:cxnLst/>
+                            <a:rect l="l" t="t" r="r" b="b"/>
+                            <a:pathLst>
+                              <a:path w="7164070" h="9420225">
+                                <a:moveTo>
+                                  <a:pt x="30480" y="9401556"/>
+                                </a:moveTo>
+                                <a:lnTo>
+                                  <a:pt x="18288" y="9401556"/>
+                                </a:lnTo>
+                                <a:lnTo>
+                                  <a:pt x="18288" y="9389377"/>
+                                </a:lnTo>
+                                <a:lnTo>
+                                  <a:pt x="0" y="9389377"/>
+                                </a:lnTo>
+                                <a:lnTo>
+                                  <a:pt x="0" y="9401556"/>
+                                </a:lnTo>
+                                <a:lnTo>
+                                  <a:pt x="0" y="9419844"/>
+                                </a:lnTo>
+                                <a:lnTo>
+                                  <a:pt x="18288" y="9419844"/>
+                                </a:lnTo>
+                                <a:lnTo>
+                                  <a:pt x="30480" y="9419844"/>
+                                </a:lnTo>
+                                <a:lnTo>
+                                  <a:pt x="30480" y="9401556"/>
+                                </a:lnTo>
+                                <a:close/>
+                              </a:path>
+                              <a:path w="7164070" h="9420225">
+                                <a:moveTo>
+                                  <a:pt x="30480" y="0"/>
+                                </a:moveTo>
+                                <a:lnTo>
+                                  <a:pt x="21336" y="0"/>
+                                </a:lnTo>
+                                <a:lnTo>
+                                  <a:pt x="21336" y="9389364"/>
+                                </a:lnTo>
+                                <a:lnTo>
+                                  <a:pt x="30480" y="9389364"/>
+                                </a:lnTo>
+                                <a:lnTo>
+                                  <a:pt x="30480" y="0"/>
+                                </a:lnTo>
+                                <a:close/>
+                              </a:path>
+                              <a:path w="7164070" h="9420225">
+                                <a:moveTo>
+                                  <a:pt x="7142734" y="0"/>
+                                </a:moveTo>
+                                <a:lnTo>
+                                  <a:pt x="7133590" y="0"/>
+                                </a:lnTo>
+                                <a:lnTo>
+                                  <a:pt x="7133590" y="9389364"/>
+                                </a:lnTo>
+                                <a:lnTo>
+                                  <a:pt x="7142734" y="9389364"/>
+                                </a:lnTo>
+                                <a:lnTo>
+                                  <a:pt x="7142734" y="0"/>
+                                </a:lnTo>
+                                <a:close/>
+                              </a:path>
+                              <a:path w="7164070" h="9420225">
+                                <a:moveTo>
+                                  <a:pt x="7164070" y="0"/>
+                                </a:moveTo>
+                                <a:lnTo>
+                                  <a:pt x="7145782" y="0"/>
+                                </a:lnTo>
+                                <a:lnTo>
+                                  <a:pt x="7145782" y="9389364"/>
+                                </a:lnTo>
+                                <a:lnTo>
+                                  <a:pt x="7164070" y="9389364"/>
+                                </a:lnTo>
+                                <a:lnTo>
+                                  <a:pt x="7164070" y="0"/>
+                                </a:lnTo>
+                                <a:close/>
+                              </a:path>
+                            </a:pathLst>
+                          </a:custGeom>
+                          <a:solidFill>
+                            <a:srgbClr val="000000"/>
+                          </a:solidFill>
+                        </wps:spPr>
+                        <wps:bodyPr wrap="square" lIns="0" tIns="0" rIns="0" bIns="0" rtlCol="0">
+                          <a:prstTxWarp prst="textNoShape">
+                            <a:avLst/>
+                          </a:prstTxWarp>
+                          <a:noAutofit/>
+                        </wps:bodyPr>
+                      </wps:wsp>
+                      <wps:wsp>
+                        <wps:cNvPr id="13" name="Graphic 10"/>
+                        <wps:cNvSpPr/>
+                        <wps:spPr>
+                          <a:xfrm>
+                            <a:off x="105918" y="9419856"/>
+                            <a:ext cx="12700" cy="12700"/>
+                          </a:xfrm>
+                          <a:custGeom>
+                            <a:avLst/>
+                            <a:gdLst/>
+                            <a:ahLst/>
+                            <a:cxnLst/>
+                            <a:rect l="l" t="t" r="r" b="b"/>
+                            <a:pathLst>
+                              <a:path w="12700" h="12700">
+                                <a:moveTo>
+                                  <a:pt x="12192" y="9144"/>
+                                </a:moveTo>
+                                <a:lnTo>
+                                  <a:pt x="3048" y="9144"/>
+                                </a:lnTo>
+                                <a:lnTo>
+                                  <a:pt x="3048" y="0"/>
+                                </a:lnTo>
+                                <a:lnTo>
+                                  <a:pt x="0" y="0"/>
+                                </a:lnTo>
+                                <a:lnTo>
+                                  <a:pt x="0" y="9144"/>
+                                </a:lnTo>
+                                <a:lnTo>
+                                  <a:pt x="0" y="12179"/>
+                                </a:lnTo>
+                                <a:lnTo>
+                                  <a:pt x="3048" y="12179"/>
+                                </a:lnTo>
+                                <a:lnTo>
+                                  <a:pt x="12192" y="12179"/>
+                                </a:lnTo>
+                                <a:lnTo>
+                                  <a:pt x="12192" y="9144"/>
+                                </a:lnTo>
+                                <a:close/>
+                              </a:path>
+                            </a:pathLst>
+                          </a:custGeom>
+                          <a:solidFill>
+                            <a:srgbClr val="FFFFFF"/>
+                          </a:solidFill>
+                        </wps:spPr>
+                        <wps:bodyPr wrap="square" lIns="0" tIns="0" rIns="0" bIns="0" rtlCol="0">
+                          <a:prstTxWarp prst="textNoShape">
+                            <a:avLst/>
+                          </a:prstTxWarp>
+                          <a:noAutofit/>
+                        </wps:bodyPr>
+                      </wps:wsp>
+                      <wps:wsp>
+                        <wps:cNvPr id="14" name="Graphic 11"/>
+                        <wps:cNvSpPr/>
+                        <wps:spPr>
+                          <a:xfrm>
+                            <a:off x="108966" y="9419856"/>
+                            <a:ext cx="7112634" cy="30480"/>
+                          </a:xfrm>
+                          <a:custGeom>
+                            <a:avLst/>
+                            <a:gdLst/>
+                            <a:ahLst/>
+                            <a:cxnLst/>
+                            <a:rect l="l" t="t" r="r" b="b"/>
+                            <a:pathLst>
+                              <a:path w="7112634" h="30480">
+                                <a:moveTo>
+                                  <a:pt x="9144" y="0"/>
+                                </a:moveTo>
+                                <a:lnTo>
+                                  <a:pt x="0" y="0"/>
+                                </a:lnTo>
+                                <a:lnTo>
+                                  <a:pt x="0" y="9131"/>
+                                </a:lnTo>
+                                <a:lnTo>
+                                  <a:pt x="9144" y="9131"/>
+                                </a:lnTo>
+                                <a:lnTo>
+                                  <a:pt x="9144" y="0"/>
+                                </a:lnTo>
+                                <a:close/>
+                              </a:path>
+                              <a:path w="7112634" h="30480">
+                                <a:moveTo>
+                                  <a:pt x="7112241" y="12179"/>
+                                </a:moveTo>
+                                <a:lnTo>
+                                  <a:pt x="9144" y="12179"/>
+                                </a:lnTo>
+                                <a:lnTo>
+                                  <a:pt x="9144" y="30467"/>
+                                </a:lnTo>
+                                <a:lnTo>
+                                  <a:pt x="7112241" y="30467"/>
+                                </a:lnTo>
+                                <a:lnTo>
+                                  <a:pt x="7112241" y="12179"/>
+                                </a:lnTo>
+                                <a:close/>
+                              </a:path>
+                            </a:pathLst>
+                          </a:custGeom>
+                          <a:solidFill>
+                            <a:srgbClr val="000000"/>
+                          </a:solidFill>
+                        </wps:spPr>
+                        <wps:bodyPr wrap="square" lIns="0" tIns="0" rIns="0" bIns="0" rtlCol="0">
+                          <a:prstTxWarp prst="textNoShape">
+                            <a:avLst/>
+                          </a:prstTxWarp>
+                          <a:noAutofit/>
+                        </wps:bodyPr>
+                      </wps:wsp>
+                      <wps:wsp>
+                        <wps:cNvPr id="15" name="Graphic 12"/>
+                        <wps:cNvSpPr/>
+                        <wps:spPr>
+                          <a:xfrm>
+                            <a:off x="118110" y="9428988"/>
+                            <a:ext cx="7103109" cy="3175"/>
+                          </a:xfrm>
+                          <a:custGeom>
+                            <a:avLst/>
+                            <a:gdLst/>
+                            <a:ahLst/>
+                            <a:cxnLst/>
+                            <a:rect l="l" t="t" r="r" b="b"/>
+                            <a:pathLst>
+                              <a:path w="7103109" h="3175">
+                                <a:moveTo>
+                                  <a:pt x="7103109" y="0"/>
+                                </a:moveTo>
+                                <a:lnTo>
+                                  <a:pt x="0" y="0"/>
+                                </a:lnTo>
+                                <a:lnTo>
+                                  <a:pt x="0" y="3047"/>
+                                </a:lnTo>
+                                <a:lnTo>
+                                  <a:pt x="7103109" y="3047"/>
+                                </a:lnTo>
+                                <a:lnTo>
+                                  <a:pt x="7103109" y="0"/>
+                                </a:lnTo>
+                                <a:close/>
+                              </a:path>
+                            </a:pathLst>
+                          </a:custGeom>
+                          <a:solidFill>
+                            <a:srgbClr val="FFFFFF"/>
+                          </a:solidFill>
+                        </wps:spPr>
+                        <wps:bodyPr wrap="square" lIns="0" tIns="0" rIns="0" bIns="0" rtlCol="0">
+                          <a:prstTxWarp prst="textNoShape">
+                            <a:avLst/>
+                          </a:prstTxWarp>
+                          <a:noAutofit/>
+                        </wps:bodyPr>
+                      </wps:wsp>
+                      <wps:wsp>
+                        <wps:cNvPr id="16" name="Graphic 13"/>
+                        <wps:cNvSpPr/>
+                        <wps:spPr>
+                          <a:xfrm>
+                            <a:off x="118110" y="9419856"/>
+                            <a:ext cx="7133590" cy="30480"/>
+                          </a:xfrm>
+                          <a:custGeom>
+                            <a:avLst/>
+                            <a:gdLst/>
+                            <a:ahLst/>
+                            <a:cxnLst/>
+                            <a:rect l="l" t="t" r="r" b="b"/>
+                            <a:pathLst>
+                              <a:path w="7133590" h="30480">
+                                <a:moveTo>
+                                  <a:pt x="7103097" y="0"/>
+                                </a:moveTo>
+                                <a:lnTo>
+                                  <a:pt x="0" y="0"/>
+                                </a:lnTo>
+                                <a:lnTo>
+                                  <a:pt x="0" y="9131"/>
+                                </a:lnTo>
+                                <a:lnTo>
+                                  <a:pt x="7103097" y="9131"/>
+                                </a:lnTo>
+                                <a:lnTo>
+                                  <a:pt x="7103097" y="0"/>
+                                </a:lnTo>
+                                <a:close/>
+                              </a:path>
+                              <a:path w="7133590" h="30480">
+                                <a:moveTo>
+                                  <a:pt x="7112254" y="0"/>
+                                </a:moveTo>
+                                <a:lnTo>
+                                  <a:pt x="7103110" y="0"/>
+                                </a:lnTo>
+                                <a:lnTo>
+                                  <a:pt x="7103110" y="9131"/>
+                                </a:lnTo>
+                                <a:lnTo>
+                                  <a:pt x="7112254" y="9131"/>
+                                </a:lnTo>
+                                <a:lnTo>
+                                  <a:pt x="7112254" y="0"/>
+                                </a:lnTo>
+                                <a:close/>
+                              </a:path>
+                              <a:path w="7133590" h="30480">
+                                <a:moveTo>
+                                  <a:pt x="7133590" y="0"/>
+                                </a:moveTo>
+                                <a:lnTo>
+                                  <a:pt x="7115302" y="0"/>
+                                </a:lnTo>
+                                <a:lnTo>
+                                  <a:pt x="7115302" y="12179"/>
+                                </a:lnTo>
+                                <a:lnTo>
+                                  <a:pt x="7103110" y="12179"/>
+                                </a:lnTo>
+                                <a:lnTo>
+                                  <a:pt x="7103110" y="30467"/>
+                                </a:lnTo>
+                                <a:lnTo>
+                                  <a:pt x="7115302" y="30467"/>
+                                </a:lnTo>
+                                <a:lnTo>
+                                  <a:pt x="7133590" y="30467"/>
+                                </a:lnTo>
+                                <a:lnTo>
+                                  <a:pt x="7133590" y="12179"/>
+                                </a:lnTo>
+                                <a:lnTo>
+                                  <a:pt x="7133590" y="0"/>
+                                </a:lnTo>
+                                <a:close/>
+                              </a:path>
+                            </a:pathLst>
+                          </a:custGeom>
+                          <a:solidFill>
+                            <a:srgbClr val="000000"/>
+                          </a:solidFill>
+                        </wps:spPr>
+                        <wps:bodyPr wrap="square" lIns="0" tIns="0" rIns="0" bIns="0" rtlCol="0">
+                          <a:prstTxWarp prst="textNoShape">
+                            <a:avLst/>
+                          </a:prstTxWarp>
+                          <a:noAutofit/>
+                        </wps:bodyPr>
+                      </wps:wsp>
+                    </wpg:wgp>
+                  </a:graphicData>
+                </a:graphic>
+              </wp:anchor>
+            </w:drawing>
+          </mc:Choice>
+          <mc:Fallback>
+            <w:pict>
+              <v:group w14:anchorId="32986E77" id="Group 1" o:spid="_x0000_s1026" style="position:absolute;margin-left:17.1pt;margin-top:24pt;width:571pt;height:744.15pt;z-index:-251657216;mso-wrap-distance-left:0;mso-wrap-distance-right:0;mso-position-horizontal-relative:page;mso-position-vertical-relative:page" coordsize="72517,94507" o:gfxdata="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">
+                <v:shapetype id="_x0000_t75" coordsize="21600,21600" o:spt="75" o:preferrelative="t" path="m@4@5l@4@11@9@11@9@5xe" filled="f" stroked="f">
+                  <v:stroke joinstyle="miter"/>
+                  <v:formulas>
+                    <v:f eqn="if lineDrawn pixelLineWidth 0"/>
+                    <v:f eqn="sum @0 1 0"/>
+                    <v:f eqn="sum 0 0 @1"/>
+                    <v:f eqn="prod @2 1 2"/>
+                    <v:f eqn="prod @3 21600 pixelWidth"/>
+                    <v:f eqn="prod @3 21600 pixelHeight"/>
+                    <v:f eqn="sum @0 0 1"/>
+                    <v:f eqn="prod @6 1 2"/>
+                    <v:f eqn="prod @7 21600 pixelWidth"/>
+                    <v:f eqn="sum @8 21600 0"/>
+                    <v:f eqn="prod @7 21600 pixelHeight"/>
+                    <v:f eqn="sum @10 21600 0"/>
+                  </v:formulas>
+                  <v:path o:extrusionok="f" gradientshapeok="t" o:connecttype="rect"/>
+                  <o:lock v:ext="edit" aspectratio="t"/>
+                </v:shapetype>
+                <v:shape id="Image 2" o:spid="_x0000_s1027" type="#_x0000_t75" alt="Premium business flyer template Vectors - Download Free High-Quality  Vectors | Magnific (formerly Freepik)" style="position:absolute;width:8534;height:94482;visibility:visible;mso-wrap-style:square" o:gfxdata="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">
+                  <v:imagedata r:id="rId5" o:title="Premium business flyer template Vectors - Download Free High-Quality  Vectors | Magnific (formerly Freepik)"/>
+                </v:shape>
+                <v:shape id="Graphic 3" o:spid="_x0000_s1028" style="position:absolute;left:876;width:305;height:304;visibility:visible;mso-wrap-style:square;v-text-anchor:top" coordsize="30480,30480" o:gfxdata="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" path="m30480,l18288,,,,,18288,,30480r18288,l18288,18288r12192,l30480,xe" fillcolor="black" stroked="f">
+                  <v:path arrowok="t"/>
+                </v:shape>
+                <v:shape id="Graphic 4" o:spid="_x0000_s1029" style="position:absolute;left:1059;top:182;width:127;height:127;visibility:visible;mso-wrap-style:square;v-text-anchor:top" coordsize="12700,12700" o:gfxdata="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" path="m12192,l3048,,,,,3048r,9144l3048,12192r,-9144l12192,3048,12192,xe" stroked="f">
+                  <v:path arrowok="t"/>
+                </v:shape>
+                <v:shape id="Graphic 5" o:spid="_x0000_s1030" style="position:absolute;left:1089;width:71127;height:304;visibility:visible;mso-wrap-style:square;v-text-anchor:top" coordsize="7112634,30480" o:gfxdata="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" path="m9144,21336l,21336r,9144l9144,30480r,-9144xem7112241,l9144,r,18288l7112241,18288r,-18288xe" fillcolor="black" stroked="f">
+                  <v:path arrowok="t"/>
+                </v:shape>
+                <v:shape id="Graphic 6" o:spid="_x0000_s1031" style="position:absolute;left:1181;top:182;width:71031;height:32;visibility:visible;mso-wrap-style:square;v-text-anchor:top" coordsize="7103109,3175" o:gfxdata="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" path="m7103109,l,,,3048r7103109,l7103109,xe" stroked="f">
+                  <v:path arrowok="t"/>
+                </v:shape>
+                <v:shape id="Graphic 7" o:spid="_x0000_s1032" style="position:absolute;left:876;width:71641;height:94202;visibility:visible;mso-wrap-style:square;v-text-anchor:top" coordsize="7164070,9420225" o:gfxdata="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" path="m18288,30480l,30480,,9419844r18288,l18288,30480xem7133577,21336r-7103097,l30480,30480r7103097,l7133577,21336xem7142734,21336r-9144,l7133590,30480r9144,l7142734,21336xem7164070,r-18288,l7133590,r,18288l7145782,18288r,12192l7164070,30480r,-12192l7164070,xe" fillcolor="black" stroked="f">
+                  <v:path arrowok="t"/>
+                </v:shape>
+                <v:shape id="Graphic 8" o:spid="_x0000_s1033" style="position:absolute;left:1059;top:304;width:31;height:93898;visibility:visible;mso-wrap-style:square;v-text-anchor:top" coordsize="3175,9389745" o:gfxdata="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" path="m3047,l,,,9389364r3047,l3047,xe" stroked="f">
+                  <v:path arrowok="t"/>
+                </v:shape>
+                <v:shape id="Graphic 9" o:spid="_x0000_s1034" style="position:absolute;left:876;top:304;width:71641;height:94203;visibility:visible;mso-wrap-style:square;v-text-anchor:top" coordsize="7164070,9420225" o:gfxdata="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" path="m30480,9401556r-12192,l18288,9389377r-18288,l,9401556r,18288l18288,9419844r12192,l30480,9401556xem30480,l21336,r,9389364l30480,9389364,30480,xem7142734,r-9144,l7133590,9389364r9144,l7142734,xem7164070,r-18288,l7145782,9389364r18288,l7164070,xe" fillcolor="black" stroked="f">
+                  <v:path arrowok="t"/>
+                </v:shape>
+                <v:shape id="Graphic 10" o:spid="_x0000_s1035" style="position:absolute;left:1059;top:94198;width:127;height:127;visibility:visible;mso-wrap-style:square;v-text-anchor:top" coordsize="12700,12700" o:gfxdata="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" path="m12192,9144r-9144,l3048,,,,,9144r,3035l3048,12179r9144,l12192,9144xe" stroked="f">
+                  <v:path arrowok="t"/>
+                </v:shape>
+                <v:shape id="Graphic 11" o:spid="_x0000_s1036" style="position:absolute;left:1089;top:94198;width:71127;height:305;visibility:visible;mso-wrap-style:square;v-text-anchor:top" coordsize="7112634,30480" o:gfxdata="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" path="m9144,l,,,9131r9144,l9144,xem7112241,12179r-7103097,l9144,30467r7103097,l7112241,12179xe" fillcolor="black" stroked="f">
+                  <v:path arrowok="t"/>
+                </v:shape>
+                <v:shape id="Graphic 12" o:spid="_x0000_s1037" style="position:absolute;left:1181;top:94289;width:71031;height:32;visibility:visible;mso-wrap-style:square;v-text-anchor:top" coordsize="7103109,3175" o:gfxdata="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" path="m7103109,l,,,3047r7103109,l7103109,xe" stroked="f">
+                  <v:path arrowok="t"/>
+                </v:shape>
+                <v:shape id="Graphic 13" o:spid="_x0000_s1038" style="position:absolute;left:1181;top:94198;width:71336;height:305;visibility:visible;mso-wrap-style:square;v-text-anchor:top" coordsize="7133590,30480" o:gfxdata="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" path="m7103097,l,,,9131r7103097,l7103097,xem7112254,r-9144,l7103110,9131r9144,l7112254,xem7133590,r-18288,l7115302,12179r-12192,l7103110,30467r12192,l7133590,30467r,-18288l7133590,xe" fillcolor="black" stroked="f">
+                  <v:path arrowok="t"/>
+                </v:shape>
+                <w10:wrap anchorx="page" anchory="page"/>
+              </v:group>
+            </w:pict>
+          </mc:Fallback>
+        </mc:AlternateContent>
+      </w:r>
+      <w:r>
+        <w:rPr>
+          <w:noProof/>
+          <w:sz w:val="20"/>
         </w:rPr>
         <w:drawing>
-          <wp:inline distT="0" distB="0" distL="0" distR="0" wp14:anchorId="3BAC3FC5" wp14:editId="7C342A65">
-            <wp:extent cx="5400040" cy="3035935"/>
+          <wp:inline distT="0" distB="0" distL="0" distR="0" wp14:anchorId="13A40A4B" wp14:editId="172BA070">
+            <wp:extent cx="1596719" cy="1564481"/>
             <wp:effectExtent l="0" t="0" r="0" b="0"/>
-            <wp:docPr id="1" name="Imagen 1"/>
+            <wp:docPr id="17" name="Imagen 17"/>
             <wp:cNvGraphicFramePr>
-              <a:graphicFrameLocks xmlns:a="http://schemas.openxmlformats.org/drawingml/2006/main" noChangeAspect="1"/>
+              <a:graphicFrameLocks xmlns:a="http://schemas.openxmlformats.org/drawingml/2006/main"/>
             </wp:cNvGraphicFramePr>
             <a:graphic xmlns:a="http://schemas.openxmlformats.org/drawingml/2006/main">
               <a:graphicData uri="http://schemas.openxmlformats.org/drawingml/2006/picture">
                 <pic:pic xmlns:pic="http://schemas.openxmlformats.org/drawingml/2006/picture">
                   <pic:nvPicPr>
-                    <pic:cNvPr id="1" name="Imagen 1"/>
-                    <pic:cNvPicPr>
-                      <a:picLocks noChangeAspect="1"/>
-                    </pic:cNvPicPr>
+                    <pic:cNvPr id="14" name="Image 14"/>
+                    <pic:cNvPicPr/>
                   </pic:nvPicPr>
                   <pic:blipFill>
-                    <a:blip r:embed="rId4"/>
+                    <a:blip r:embed="rId6" cstate="print"/>
                     <a:stretch>
                       <a:fillRect/>
                     </a:stretch>
@@ -33,7 +924,7 @@
                   <pic:spPr>
                     <a:xfrm>
                       <a:off x="0" y="0"/>
-                      <a:ext cx="5400040" cy="3035935"/>
+                      <a:ext cx="1596719" cy="1564481"/>
                     </a:xfrm>
                     <a:prstGeom prst="rect">
                       <a:avLst/>
@@ -46,6 +937,1233 @@
         </w:drawing>
       </w:r>
     </w:p>
+    <w:p>
+      <w:pPr>
+        <w:pStyle w:val="Textoindependiente"/>
+        <w:spacing w:before="27"/>
+        <w:jc w:val="left"/>
+        <w:rPr>
+          <w:sz w:val="36"/>
+        </w:rPr>
+      </w:pPr>
+    </w:p>
+    <w:p>
+      <w:pPr>
+        <w:spacing w:before="1"/>
+        <w:ind w:right="427"/>
+        <w:jc w:val="center"/>
+        <w:rPr>
+          <w:rFonts w:ascii="Algerian"/>
+          <w:sz w:val="36"/>
+        </w:rPr>
+      </w:pPr>
+      <w:r>
+        <w:rPr>
+          <w:rFonts w:ascii="Algerian"/>
+          <w:color w:val="BE9000"/>
+          <w:sz w:val="36"/>
+        </w:rPr>
+        <w:t>U</w:t>
+      </w:r>
+      <w:r>
+        <w:rPr>
+          <w:rFonts w:ascii="Algerian"/>
+          <w:color w:val="BE9000"/>
+          <w:spacing w:val="-32"/>
+          <w:sz w:val="36"/>
+        </w:rPr>
+        <w:t xml:space="preserve"> </w:t>
+      </w:r>
+      <w:r>
+        <w:rPr>
+          <w:rFonts w:ascii="Algerian"/>
+          <w:color w:val="BE9000"/>
+          <w:sz w:val="36"/>
+        </w:rPr>
+        <w:t>N</w:t>
+      </w:r>
+      <w:r>
+        <w:rPr>
+          <w:rFonts w:ascii="Algerian"/>
+          <w:color w:val="BE9000"/>
+          <w:spacing w:val="-31"/>
+          <w:sz w:val="36"/>
+        </w:rPr>
+        <w:t xml:space="preserve"> </w:t>
+      </w:r>
+      <w:r>
+        <w:rPr>
+          <w:rFonts w:ascii="Algerian"/>
+          <w:color w:val="BE9000"/>
+          <w:sz w:val="36"/>
+        </w:rPr>
+        <w:t>I</w:t>
+      </w:r>
+      <w:r>
+        <w:rPr>
+          <w:rFonts w:ascii="Algerian"/>
+          <w:color w:val="BE9000"/>
+          <w:spacing w:val="-31"/>
+          <w:sz w:val="36"/>
+        </w:rPr>
+        <w:t xml:space="preserve"> </w:t>
+      </w:r>
+      <w:r>
+        <w:rPr>
+          <w:rFonts w:ascii="Algerian"/>
+          <w:color w:val="BE9000"/>
+          <w:sz w:val="36"/>
+        </w:rPr>
+        <w:t>V</w:t>
+      </w:r>
+      <w:r>
+        <w:rPr>
+          <w:rFonts w:ascii="Algerian"/>
+          <w:color w:val="BE9000"/>
+          <w:spacing w:val="-31"/>
+          <w:sz w:val="36"/>
+        </w:rPr>
+        <w:t xml:space="preserve"> </w:t>
+      </w:r>
+      <w:r>
+        <w:rPr>
+          <w:rFonts w:ascii="Algerian"/>
+          <w:color w:val="BE9000"/>
+          <w:sz w:val="36"/>
+        </w:rPr>
+        <w:t>E</w:t>
+      </w:r>
+      <w:r>
+        <w:rPr>
+          <w:rFonts w:ascii="Algerian"/>
+          <w:color w:val="BE9000"/>
+          <w:spacing w:val="-32"/>
+          <w:sz w:val="36"/>
+        </w:rPr>
+        <w:t xml:space="preserve"> </w:t>
+      </w:r>
+      <w:r>
+        <w:rPr>
+          <w:rFonts w:ascii="Algerian"/>
+          <w:color w:val="BE9000"/>
+          <w:sz w:val="36"/>
+        </w:rPr>
+        <w:t>R</w:t>
+      </w:r>
+      <w:r>
+        <w:rPr>
+          <w:rFonts w:ascii="Algerian"/>
+          <w:color w:val="BE9000"/>
+          <w:spacing w:val="-32"/>
+          <w:sz w:val="36"/>
+        </w:rPr>
+        <w:t xml:space="preserve"> </w:t>
+      </w:r>
+      <w:r>
+        <w:rPr>
+          <w:rFonts w:ascii="Algerian"/>
+          <w:color w:val="BE9000"/>
+          <w:sz w:val="36"/>
+        </w:rPr>
+        <w:t>S</w:t>
+      </w:r>
+      <w:r>
+        <w:rPr>
+          <w:rFonts w:ascii="Algerian"/>
+          <w:color w:val="BE9000"/>
+          <w:spacing w:val="-32"/>
+          <w:sz w:val="36"/>
+        </w:rPr>
+        <w:t xml:space="preserve"> </w:t>
+      </w:r>
+      <w:r>
+        <w:rPr>
+          <w:rFonts w:ascii="Algerian"/>
+          <w:color w:val="BE9000"/>
+          <w:sz w:val="36"/>
+        </w:rPr>
+        <w:t>I</w:t>
+      </w:r>
+      <w:r>
+        <w:rPr>
+          <w:rFonts w:ascii="Algerian"/>
+          <w:color w:val="BE9000"/>
+          <w:spacing w:val="-31"/>
+          <w:sz w:val="36"/>
+        </w:rPr>
+        <w:t xml:space="preserve"> </w:t>
+      </w:r>
+      <w:r>
+        <w:rPr>
+          <w:rFonts w:ascii="Algerian"/>
+          <w:color w:val="BE9000"/>
+          <w:sz w:val="36"/>
+        </w:rPr>
+        <w:t>D</w:t>
+      </w:r>
+      <w:r>
+        <w:rPr>
+          <w:rFonts w:ascii="Algerian"/>
+          <w:color w:val="BE9000"/>
+          <w:spacing w:val="-30"/>
+          <w:sz w:val="36"/>
+        </w:rPr>
+        <w:t xml:space="preserve"> </w:t>
+      </w:r>
+      <w:r>
+        <w:rPr>
+          <w:rFonts w:ascii="Algerian"/>
+          <w:color w:val="BE9000"/>
+          <w:sz w:val="36"/>
+        </w:rPr>
+        <w:t>A</w:t>
+      </w:r>
+      <w:r>
+        <w:rPr>
+          <w:rFonts w:ascii="Algerian"/>
+          <w:color w:val="BE9000"/>
+          <w:spacing w:val="-30"/>
+          <w:sz w:val="36"/>
+        </w:rPr>
+        <w:t xml:space="preserve"> </w:t>
+      </w:r>
+      <w:r>
+        <w:rPr>
+          <w:rFonts w:ascii="Algerian"/>
+          <w:color w:val="BE9000"/>
+          <w:sz w:val="36"/>
+        </w:rPr>
+        <w:t>D</w:t>
+      </w:r>
+      <w:r>
+        <w:rPr>
+          <w:rFonts w:ascii="Algerian"/>
+          <w:color w:val="BE9000"/>
+          <w:spacing w:val="73"/>
+          <w:w w:val="150"/>
+          <w:sz w:val="36"/>
+        </w:rPr>
+        <w:t xml:space="preserve"> </w:t>
+      </w:r>
+      <w:r>
+        <w:rPr>
+          <w:rFonts w:ascii="Algerian"/>
+          <w:color w:val="BE9000"/>
+          <w:sz w:val="36"/>
+        </w:rPr>
+        <w:t>T</w:t>
+      </w:r>
+      <w:r>
+        <w:rPr>
+          <w:rFonts w:ascii="Algerian"/>
+          <w:color w:val="BE9000"/>
+          <w:spacing w:val="-31"/>
+          <w:sz w:val="36"/>
+        </w:rPr>
+        <w:t xml:space="preserve"> </w:t>
+      </w:r>
+      <w:r>
+        <w:rPr>
+          <w:rFonts w:ascii="Algerian"/>
+          <w:color w:val="BE9000"/>
+          <w:sz w:val="36"/>
+        </w:rPr>
+        <w:t>E</w:t>
+      </w:r>
+      <w:r>
+        <w:rPr>
+          <w:rFonts w:ascii="Algerian"/>
+          <w:color w:val="BE9000"/>
+          <w:spacing w:val="-32"/>
+          <w:sz w:val="36"/>
+        </w:rPr>
+        <w:t xml:space="preserve"> </w:t>
+      </w:r>
+      <w:r>
+        <w:rPr>
+          <w:rFonts w:ascii="Algerian"/>
+          <w:color w:val="BE9000"/>
+          <w:sz w:val="36"/>
+        </w:rPr>
+        <w:t>C</w:t>
+      </w:r>
+      <w:r>
+        <w:rPr>
+          <w:rFonts w:ascii="Algerian"/>
+          <w:color w:val="BE9000"/>
+          <w:spacing w:val="-32"/>
+          <w:sz w:val="36"/>
+        </w:rPr>
+        <w:t xml:space="preserve"> </w:t>
+      </w:r>
+      <w:r>
+        <w:rPr>
+          <w:rFonts w:ascii="Algerian"/>
+          <w:color w:val="BE9000"/>
+          <w:sz w:val="36"/>
+        </w:rPr>
+        <w:t>N</w:t>
+      </w:r>
+      <w:r>
+        <w:rPr>
+          <w:rFonts w:ascii="Algerian"/>
+          <w:color w:val="BE9000"/>
+          <w:spacing w:val="-31"/>
+          <w:sz w:val="36"/>
+        </w:rPr>
+        <w:t xml:space="preserve"> </w:t>
+      </w:r>
+      <w:r>
+        <w:rPr>
+          <w:rFonts w:ascii="Algerian"/>
+          <w:color w:val="BE9000"/>
+          <w:sz w:val="36"/>
+        </w:rPr>
+        <w:t>I</w:t>
+      </w:r>
+      <w:r>
+        <w:rPr>
+          <w:rFonts w:ascii="Algerian"/>
+          <w:color w:val="BE9000"/>
+          <w:spacing w:val="-31"/>
+          <w:sz w:val="36"/>
+        </w:rPr>
+        <w:t xml:space="preserve"> </w:t>
+      </w:r>
+      <w:r>
+        <w:rPr>
+          <w:rFonts w:ascii="Algerian"/>
+          <w:color w:val="BE9000"/>
+          <w:sz w:val="36"/>
+        </w:rPr>
+        <w:t>C</w:t>
+      </w:r>
+      <w:r>
+        <w:rPr>
+          <w:rFonts w:ascii="Algerian"/>
+          <w:color w:val="BE9000"/>
+          <w:spacing w:val="-32"/>
+          <w:sz w:val="36"/>
+        </w:rPr>
+        <w:t xml:space="preserve"> </w:t>
+      </w:r>
+      <w:r>
+        <w:rPr>
+          <w:rFonts w:ascii="Algerian"/>
+          <w:color w:val="BE9000"/>
+          <w:sz w:val="36"/>
+        </w:rPr>
+        <w:t>A</w:t>
+      </w:r>
+      <w:r>
+        <w:rPr>
+          <w:rFonts w:ascii="Algerian"/>
+          <w:color w:val="BE9000"/>
+          <w:spacing w:val="75"/>
+          <w:w w:val="150"/>
+          <w:sz w:val="36"/>
+        </w:rPr>
+        <w:t xml:space="preserve"> </w:t>
+      </w:r>
+      <w:r>
+        <w:rPr>
+          <w:rFonts w:ascii="Algerian"/>
+          <w:color w:val="BE9000"/>
+          <w:sz w:val="36"/>
+        </w:rPr>
+        <w:t>D</w:t>
+      </w:r>
+      <w:r>
+        <w:rPr>
+          <w:rFonts w:ascii="Algerian"/>
+          <w:color w:val="BE9000"/>
+          <w:spacing w:val="-30"/>
+          <w:sz w:val="36"/>
+        </w:rPr>
+        <w:t xml:space="preserve"> </w:t>
+      </w:r>
+      <w:r>
+        <w:rPr>
+          <w:rFonts w:ascii="Algerian"/>
+          <w:color w:val="BE9000"/>
+          <w:sz w:val="36"/>
+        </w:rPr>
+        <w:t>E</w:t>
+      </w:r>
+      <w:r>
+        <w:rPr>
+          <w:rFonts w:ascii="Algerian"/>
+          <w:color w:val="BE9000"/>
+          <w:spacing w:val="72"/>
+          <w:w w:val="150"/>
+          <w:sz w:val="36"/>
+        </w:rPr>
+        <w:t xml:space="preserve"> </w:t>
+      </w:r>
+      <w:r>
+        <w:rPr>
+          <w:rFonts w:ascii="Algerian"/>
+          <w:color w:val="BE9000"/>
+          <w:sz w:val="36"/>
+        </w:rPr>
+        <w:t>M</w:t>
+      </w:r>
+      <w:r>
+        <w:rPr>
+          <w:rFonts w:ascii="Algerian"/>
+          <w:color w:val="BE9000"/>
+          <w:spacing w:val="-30"/>
+          <w:sz w:val="36"/>
+        </w:rPr>
+        <w:t xml:space="preserve"> </w:t>
+      </w:r>
+      <w:r>
+        <w:rPr>
+          <w:rFonts w:ascii="Algerian"/>
+          <w:color w:val="BE9000"/>
+          <w:sz w:val="36"/>
+        </w:rPr>
+        <w:t>A</w:t>
+      </w:r>
+      <w:r>
+        <w:rPr>
+          <w:rFonts w:ascii="Algerian"/>
+          <w:color w:val="BE9000"/>
+          <w:spacing w:val="-30"/>
+          <w:sz w:val="36"/>
+        </w:rPr>
+        <w:t xml:space="preserve"> </w:t>
+      </w:r>
+      <w:r>
+        <w:rPr>
+          <w:rFonts w:ascii="Algerian"/>
+          <w:color w:val="BE9000"/>
+          <w:sz w:val="36"/>
+        </w:rPr>
+        <w:t>N</w:t>
+      </w:r>
+      <w:r>
+        <w:rPr>
+          <w:rFonts w:ascii="Algerian"/>
+          <w:color w:val="BE9000"/>
+          <w:spacing w:val="-34"/>
+          <w:sz w:val="36"/>
+        </w:rPr>
+        <w:t xml:space="preserve"> </w:t>
+      </w:r>
+      <w:r>
+        <w:rPr>
+          <w:rFonts w:ascii="Algerian"/>
+          <w:color w:val="BE9000"/>
+          <w:sz w:val="36"/>
+        </w:rPr>
+        <w:t>A</w:t>
+      </w:r>
+      <w:r>
+        <w:rPr>
+          <w:rFonts w:ascii="Algerian"/>
+          <w:color w:val="BE9000"/>
+          <w:spacing w:val="-30"/>
+          <w:sz w:val="36"/>
+        </w:rPr>
+        <w:t xml:space="preserve"> </w:t>
+      </w:r>
+      <w:r>
+        <w:rPr>
+          <w:rFonts w:ascii="Algerian"/>
+          <w:color w:val="BE9000"/>
+          <w:sz w:val="36"/>
+        </w:rPr>
+        <w:t>B</w:t>
+      </w:r>
+      <w:r>
+        <w:rPr>
+          <w:rFonts w:ascii="Algerian"/>
+          <w:color w:val="BE9000"/>
+          <w:spacing w:val="-31"/>
+          <w:sz w:val="36"/>
+        </w:rPr>
+        <w:t xml:space="preserve"> </w:t>
+      </w:r>
+      <w:r>
+        <w:rPr>
+          <w:rFonts w:ascii="Algerian"/>
+          <w:color w:val="BE9000"/>
+          <w:spacing w:val="-10"/>
+          <w:sz w:val="36"/>
+        </w:rPr>
+        <w:t>I</w:t>
+      </w:r>
+    </w:p>
+    <w:p>
+      <w:pPr>
+        <w:tabs>
+          <w:tab w:val="left" w:pos="2004"/>
+        </w:tabs>
+        <w:spacing w:before="62"/>
+        <w:ind w:right="358"/>
+        <w:jc w:val="center"/>
+        <w:rPr>
+          <w:rFonts w:ascii="Georgia" w:hAnsi="Georgia"/>
+          <w:sz w:val="40"/>
+        </w:rPr>
+      </w:pPr>
+      <w:r>
+        <w:rPr>
+          <w:rFonts w:ascii="Georgia" w:hAnsi="Georgia"/>
+          <w:color w:val="AF8D56"/>
+          <w:spacing w:val="-2"/>
+          <w:sz w:val="40"/>
+        </w:rPr>
+        <w:t>—————</w:t>
+      </w:r>
+      <w:r>
+        <w:rPr>
+          <w:rFonts w:ascii="Georgia" w:hAnsi="Georgia"/>
+          <w:color w:val="AF8D56"/>
+          <w:sz w:val="40"/>
+        </w:rPr>
+        <w:tab/>
+      </w:r>
+      <w:r>
+        <w:rPr>
+          <w:rFonts w:ascii="Lucida Sans Unicode" w:hAnsi="Lucida Sans Unicode"/>
+          <w:color w:val="AF8D56"/>
+          <w:sz w:val="40"/>
+        </w:rPr>
+        <w:t>◆</w:t>
+      </w:r>
+      <w:r>
+        <w:rPr>
+          <w:rFonts w:ascii="Lucida Sans Unicode" w:hAnsi="Lucida Sans Unicode"/>
+          <w:color w:val="AF8D56"/>
+          <w:spacing w:val="22"/>
+          <w:sz w:val="40"/>
+        </w:rPr>
+        <w:t xml:space="preserve">  </w:t>
+      </w:r>
+      <w:r>
+        <w:rPr>
+          <w:rFonts w:ascii="Georgia" w:hAnsi="Georgia"/>
+          <w:color w:val="AF8D56"/>
+          <w:sz w:val="40"/>
+        </w:rPr>
+        <w:t>————</w:t>
+      </w:r>
+      <w:r>
+        <w:rPr>
+          <w:rFonts w:ascii="Georgia" w:hAnsi="Georgia"/>
+          <w:color w:val="AF8D56"/>
+          <w:spacing w:val="-10"/>
+          <w:sz w:val="40"/>
+        </w:rPr>
+        <w:t>—</w:t>
+      </w:r>
+    </w:p>
+    <w:p>
+      <w:pPr>
+        <w:spacing w:before="108"/>
+        <w:ind w:right="361"/>
+        <w:jc w:val="center"/>
+        <w:rPr>
+          <w:sz w:val="32"/>
+        </w:rPr>
+      </w:pPr>
+      <w:r>
+        <w:rPr>
+          <w:color w:val="BE9000"/>
+          <w:spacing w:val="-2"/>
+          <w:sz w:val="32"/>
+        </w:rPr>
+        <w:t>CARRERA:</w:t>
+      </w:r>
+    </w:p>
+    <w:p>
+      <w:pPr>
+        <w:spacing w:before="217"/>
+        <w:ind w:right="357"/>
+        <w:jc w:val="center"/>
+        <w:rPr>
+          <w:b/>
+          <w:i/>
+          <w:sz w:val="28"/>
+        </w:rPr>
+      </w:pPr>
+      <w:r>
+        <w:rPr>
+          <w:b/>
+          <w:i/>
+          <w:sz w:val="28"/>
+        </w:rPr>
+        <w:t>TECNOLOGIA</w:t>
+      </w:r>
+      <w:r>
+        <w:rPr>
+          <w:b/>
+          <w:i/>
+          <w:spacing w:val="-4"/>
+          <w:sz w:val="28"/>
+        </w:rPr>
+        <w:t xml:space="preserve"> </w:t>
+      </w:r>
+      <w:r>
+        <w:rPr>
+          <w:b/>
+          <w:i/>
+          <w:sz w:val="28"/>
+        </w:rPr>
+        <w:t>DE</w:t>
+      </w:r>
+      <w:r>
+        <w:rPr>
+          <w:b/>
+          <w:i/>
+          <w:spacing w:val="-7"/>
+          <w:sz w:val="28"/>
+        </w:rPr>
+        <w:t xml:space="preserve"> </w:t>
+      </w:r>
+      <w:r>
+        <w:rPr>
+          <w:b/>
+          <w:i/>
+          <w:sz w:val="28"/>
+        </w:rPr>
+        <w:t>LA</w:t>
+      </w:r>
+      <w:r>
+        <w:rPr>
+          <w:b/>
+          <w:i/>
+          <w:spacing w:val="-3"/>
+          <w:sz w:val="28"/>
+        </w:rPr>
+        <w:t xml:space="preserve"> </w:t>
+      </w:r>
+      <w:r>
+        <w:rPr>
+          <w:b/>
+          <w:i/>
+          <w:spacing w:val="-2"/>
+          <w:sz w:val="28"/>
+        </w:rPr>
+        <w:t>INFORMACION</w:t>
+      </w:r>
+    </w:p>
+    <w:p>
+      <w:pPr>
+        <w:tabs>
+          <w:tab w:val="left" w:pos="2004"/>
+        </w:tabs>
+        <w:spacing w:before="151"/>
+        <w:ind w:right="359"/>
+        <w:jc w:val="center"/>
+        <w:rPr>
+          <w:rFonts w:ascii="Georgia" w:hAnsi="Georgia"/>
+          <w:sz w:val="40"/>
+        </w:rPr>
+      </w:pPr>
+      <w:r>
+        <w:rPr>
+          <w:rFonts w:ascii="Georgia" w:hAnsi="Georgia"/>
+          <w:color w:val="AF8D56"/>
+          <w:spacing w:val="-2"/>
+          <w:sz w:val="40"/>
+        </w:rPr>
+        <w:t>—————</w:t>
+      </w:r>
+      <w:r>
+        <w:rPr>
+          <w:rFonts w:ascii="Georgia" w:hAnsi="Georgia"/>
+          <w:color w:val="AF8D56"/>
+          <w:sz w:val="40"/>
+        </w:rPr>
+        <w:tab/>
+      </w:r>
+      <w:r>
+        <w:rPr>
+          <w:rFonts w:ascii="Lucida Sans Unicode" w:hAnsi="Lucida Sans Unicode"/>
+          <w:color w:val="AF8D56"/>
+          <w:sz w:val="40"/>
+        </w:rPr>
+        <w:t>◆</w:t>
+      </w:r>
+      <w:r>
+        <w:rPr>
+          <w:rFonts w:ascii="Lucida Sans Unicode" w:hAnsi="Lucida Sans Unicode"/>
+          <w:color w:val="AF8D56"/>
+          <w:spacing w:val="22"/>
+          <w:sz w:val="40"/>
+        </w:rPr>
+        <w:t xml:space="preserve">  </w:t>
+      </w:r>
+      <w:r>
+        <w:rPr>
+          <w:rFonts w:ascii="Georgia" w:hAnsi="Georgia"/>
+          <w:color w:val="AF8D56"/>
+          <w:sz w:val="40"/>
+        </w:rPr>
+        <w:t>————</w:t>
+      </w:r>
+      <w:r>
+        <w:rPr>
+          <w:rFonts w:ascii="Georgia" w:hAnsi="Georgia"/>
+          <w:color w:val="AF8D56"/>
+          <w:spacing w:val="-10"/>
+          <w:sz w:val="40"/>
+        </w:rPr>
+        <w:t>—</w:t>
+      </w:r>
+    </w:p>
+    <w:p>
+      <w:pPr>
+        <w:spacing w:before="109"/>
+        <w:ind w:right="361"/>
+        <w:jc w:val="center"/>
+        <w:rPr>
+          <w:sz w:val="36"/>
+        </w:rPr>
+      </w:pPr>
+      <w:r>
+        <w:rPr>
+          <w:color w:val="BE9000"/>
+          <w:sz w:val="36"/>
+        </w:rPr>
+        <w:t>ACTIVIDAD</w:t>
+      </w:r>
+      <w:r>
+        <w:rPr>
+          <w:color w:val="BE9000"/>
+          <w:spacing w:val="-9"/>
+          <w:sz w:val="36"/>
+        </w:rPr>
+        <w:t xml:space="preserve"> </w:t>
+      </w:r>
+      <w:r>
+        <w:rPr>
+          <w:color w:val="BE9000"/>
+          <w:spacing w:val="-5"/>
+          <w:sz w:val="36"/>
+        </w:rPr>
+        <w:t>#1</w:t>
+      </w:r>
+    </w:p>
+    <w:p>
+      <w:pPr>
+        <w:ind w:left="365" w:right="729"/>
+        <w:jc w:val="center"/>
+        <w:rPr>
+          <w:b/>
+          <w:sz w:val="36"/>
+          <w:szCs w:val="24"/>
+        </w:rPr>
+      </w:pPr>
+      <w:r>
+        <w:rPr>
+          <w:b/>
+          <w:sz w:val="36"/>
+          <w:szCs w:val="24"/>
+        </w:rPr>
+        <w:t xml:space="preserve">Estudio de Caso </w:t>
+      </w:r>
+    </w:p>
+    <w:p>
+      <w:pPr>
+        <w:ind w:left="365" w:right="729"/>
+        <w:jc w:val="center"/>
+        <w:rPr>
+          <w:b/>
+          <w:sz w:val="36"/>
+          <w:szCs w:val="24"/>
+        </w:rPr>
+      </w:pPr>
+      <w:r>
+        <w:rPr>
+          <w:b/>
+          <w:sz w:val="36"/>
+          <w:szCs w:val="24"/>
+        </w:rPr>
+        <w:t>Sistema de Control de Rescate y Adopción Animal</w:t>
+      </w:r>
+    </w:p>
+    <w:p>
+      <w:pPr>
+        <w:tabs>
+          <w:tab w:val="left" w:pos="2004"/>
+        </w:tabs>
+        <w:spacing w:before="311"/>
+        <w:ind w:right="359"/>
+        <w:jc w:val="center"/>
+        <w:rPr>
+          <w:rFonts w:ascii="Georgia" w:hAnsi="Georgia"/>
+          <w:sz w:val="40"/>
+        </w:rPr>
+      </w:pPr>
+      <w:r>
+        <w:rPr>
+          <w:rFonts w:ascii="Georgia" w:hAnsi="Georgia"/>
+          <w:color w:val="AF8D56"/>
+          <w:spacing w:val="-2"/>
+          <w:sz w:val="40"/>
+        </w:rPr>
+        <w:t>—————</w:t>
+      </w:r>
+      <w:r>
+        <w:rPr>
+          <w:rFonts w:ascii="Georgia" w:hAnsi="Georgia"/>
+          <w:color w:val="AF8D56"/>
+          <w:sz w:val="40"/>
+        </w:rPr>
+        <w:tab/>
+      </w:r>
+      <w:r>
+        <w:rPr>
+          <w:rFonts w:ascii="Lucida Sans Unicode" w:hAnsi="Lucida Sans Unicode"/>
+          <w:color w:val="AF8D56"/>
+          <w:sz w:val="40"/>
+        </w:rPr>
+        <w:t>◆</w:t>
+      </w:r>
+      <w:r>
+        <w:rPr>
+          <w:rFonts w:ascii="Lucida Sans Unicode" w:hAnsi="Lucida Sans Unicode"/>
+          <w:color w:val="AF8D56"/>
+          <w:spacing w:val="22"/>
+          <w:sz w:val="40"/>
+        </w:rPr>
+        <w:t xml:space="preserve">  </w:t>
+      </w:r>
+      <w:r>
+        <w:rPr>
+          <w:rFonts w:ascii="Georgia" w:hAnsi="Georgia"/>
+          <w:color w:val="AF8D56"/>
+          <w:sz w:val="40"/>
+        </w:rPr>
+        <w:t>————</w:t>
+      </w:r>
+      <w:r>
+        <w:rPr>
+          <w:rFonts w:ascii="Georgia" w:hAnsi="Georgia"/>
+          <w:color w:val="AF8D56"/>
+          <w:spacing w:val="-10"/>
+          <w:sz w:val="40"/>
+        </w:rPr>
+        <w:t>—</w:t>
+      </w:r>
+    </w:p>
+    <w:p>
+      <w:pPr>
+        <w:tabs>
+          <w:tab w:val="left" w:pos="3670"/>
+        </w:tabs>
+        <w:spacing w:before="393"/>
+        <w:ind w:left="1440"/>
+        <w:rPr>
+          <w:b/>
+          <w:i/>
+          <w:sz w:val="36"/>
+        </w:rPr>
+      </w:pPr>
+      <w:r>
+        <w:rPr>
+          <w:b/>
+          <w:i/>
+          <w:color w:val="BE9000"/>
+          <w:spacing w:val="-2"/>
+          <w:sz w:val="28"/>
+        </w:rPr>
+        <w:t>DOCENTE:</w:t>
+      </w:r>
+      <w:r>
+        <w:rPr>
+          <w:b/>
+          <w:i/>
+          <w:color w:val="BE9000"/>
+          <w:sz w:val="28"/>
+        </w:rPr>
+        <w:tab/>
+      </w:r>
+      <w:r>
+        <w:rPr>
+          <w:b/>
+          <w:i/>
+          <w:spacing w:val="-4"/>
+          <w:sz w:val="36"/>
+        </w:rPr>
+        <w:t>Ing.</w:t>
+      </w:r>
+      <w:r>
+        <w:rPr>
+          <w:b/>
+          <w:i/>
+          <w:spacing w:val="-7"/>
+          <w:sz w:val="36"/>
+        </w:rPr>
+        <w:t xml:space="preserve"> </w:t>
+      </w:r>
+      <w:r>
+        <w:rPr>
+          <w:b/>
+          <w:i/>
+          <w:spacing w:val="-4"/>
+          <w:sz w:val="36"/>
+        </w:rPr>
+        <w:t>Jorge Zambrano</w:t>
+      </w:r>
+    </w:p>
+    <w:p>
+      <w:pPr>
+        <w:pStyle w:val="Ttulo"/>
+        <w:tabs>
+          <w:tab w:val="left" w:pos="3600"/>
+        </w:tabs>
+      </w:pPr>
+      <w:r>
+        <w:rPr>
+          <w:rFonts w:asciiTheme="minorHAnsi" w:hAnsiTheme="minorHAnsi" w:cstheme="minorHAnsi"/>
+          <w:color w:val="BE9000"/>
+          <w:spacing w:val="-2"/>
+          <w:sz w:val="28"/>
+        </w:rPr>
+        <w:t>MATERIA:</w:t>
+      </w:r>
+      <w:r>
+        <w:rPr>
+          <w:color w:val="BE9000"/>
+          <w:sz w:val="28"/>
+        </w:rPr>
+        <w:tab/>
+      </w:r>
+      <w:r>
+        <w:rPr>
+          <w:szCs w:val="44"/>
+        </w:rPr>
+        <w:t xml:space="preserve">Desarrollo de Sistemas Informáticos </w:t>
+      </w:r>
+    </w:p>
+    <w:p>
+      <w:pPr>
+        <w:tabs>
+          <w:tab w:val="left" w:pos="3600"/>
+        </w:tabs>
+        <w:spacing w:before="222"/>
+        <w:ind w:left="1440"/>
+        <w:rPr>
+          <w:b/>
+          <w:i/>
+          <w:sz w:val="36"/>
+        </w:rPr>
+      </w:pPr>
+      <w:r>
+        <w:rPr>
+          <w:b/>
+          <w:i/>
+          <w:color w:val="BE9000"/>
+          <w:spacing w:val="-2"/>
+          <w:sz w:val="28"/>
+        </w:rPr>
+        <w:t>SEMESTRE:</w:t>
+      </w:r>
+      <w:r>
+        <w:rPr>
+          <w:b/>
+          <w:i/>
+          <w:color w:val="BE9000"/>
+          <w:sz w:val="28"/>
+        </w:rPr>
+        <w:tab/>
+      </w:r>
+      <w:r>
+        <w:rPr>
+          <w:b/>
+          <w:i/>
+          <w:sz w:val="36"/>
+        </w:rPr>
+        <w:t>Quinto</w:t>
+      </w:r>
+      <w:r>
+        <w:rPr>
+          <w:b/>
+          <w:i/>
+          <w:spacing w:val="-1"/>
+          <w:sz w:val="36"/>
+        </w:rPr>
+        <w:t xml:space="preserve"> </w:t>
+      </w:r>
+      <w:r>
+        <w:rPr>
+          <w:b/>
+          <w:i/>
+          <w:spacing w:val="-2"/>
+          <w:sz w:val="36"/>
+        </w:rPr>
+        <w:t>Semestre</w:t>
+      </w:r>
+    </w:p>
+    <w:p>
+      <w:pPr>
+        <w:tabs>
+          <w:tab w:val="left" w:pos="3600"/>
+        </w:tabs>
+        <w:spacing w:before="222"/>
+        <w:ind w:left="1440"/>
+        <w:rPr>
+          <w:b/>
+          <w:i/>
+          <w:sz w:val="36"/>
+        </w:rPr>
+      </w:pPr>
+      <w:r>
+        <w:rPr>
+          <w:b/>
+          <w:i/>
+          <w:color w:val="BE9000"/>
+          <w:spacing w:val="-2"/>
+          <w:sz w:val="28"/>
+        </w:rPr>
+        <w:t>ESTUDIANTE:</w:t>
+      </w:r>
+      <w:r>
+        <w:rPr>
+          <w:b/>
+          <w:i/>
+          <w:color w:val="BE9000"/>
+          <w:sz w:val="28"/>
+        </w:rPr>
+        <w:tab/>
+      </w:r>
+      <w:r>
+        <w:rPr>
+          <w:b/>
+          <w:i/>
+          <w:sz w:val="36"/>
+        </w:rPr>
+        <w:t>Su</w:t>
+      </w:r>
+      <w:r>
+        <w:rPr>
+          <w:b/>
+          <w:i/>
+          <w:sz w:val="36"/>
+        </w:rPr>
+        <w:t>á</w:t>
+      </w:r>
+      <w:r>
+        <w:rPr>
+          <w:b/>
+          <w:i/>
+          <w:sz w:val="36"/>
+        </w:rPr>
+        <w:t>rez</w:t>
+      </w:r>
+      <w:r>
+        <w:rPr>
+          <w:b/>
+          <w:i/>
+          <w:spacing w:val="-2"/>
+          <w:sz w:val="36"/>
+        </w:rPr>
+        <w:t xml:space="preserve"> </w:t>
+      </w:r>
+      <w:proofErr w:type="spellStart"/>
+      <w:r>
+        <w:rPr>
+          <w:b/>
+          <w:i/>
+          <w:sz w:val="36"/>
+        </w:rPr>
+        <w:t>Cho</w:t>
+      </w:r>
+      <w:r>
+        <w:rPr>
+          <w:b/>
+          <w:i/>
+          <w:sz w:val="36"/>
+        </w:rPr>
+        <w:t>é</w:t>
+      </w:r>
+      <w:r>
+        <w:rPr>
+          <w:b/>
+          <w:i/>
+          <w:sz w:val="36"/>
+        </w:rPr>
+        <w:t>z</w:t>
+      </w:r>
+      <w:proofErr w:type="spellEnd"/>
+      <w:r>
+        <w:rPr>
+          <w:b/>
+          <w:i/>
+          <w:sz w:val="36"/>
+        </w:rPr>
+        <w:t xml:space="preserve"> Juan</w:t>
+      </w:r>
+      <w:r>
+        <w:rPr>
+          <w:b/>
+          <w:i/>
+          <w:spacing w:val="-2"/>
+          <w:sz w:val="36"/>
+        </w:rPr>
+        <w:t xml:space="preserve"> Leonardo</w:t>
+      </w:r>
+    </w:p>
+    <w:p>
+      <w:pPr>
+        <w:pStyle w:val="Textoindependiente"/>
+        <w:spacing w:before="29"/>
+        <w:jc w:val="left"/>
+        <w:rPr>
+          <w:b/>
+          <w:i/>
+          <w:sz w:val="36"/>
+        </w:rPr>
+      </w:pPr>
+    </w:p>
+    <w:p>
+      <w:pPr>
+        <w:tabs>
+          <w:tab w:val="left" w:pos="2761"/>
+          <w:tab w:val="center" w:pos="4679"/>
+        </w:tabs>
+        <w:ind w:right="361"/>
+        <w:rPr>
+          <w:rFonts w:ascii="Algerian"/>
+          <w:sz w:val="33"/>
+        </w:rPr>
+      </w:pPr>
+      <w:r>
+        <w:rPr>
+          <w:rFonts w:ascii="Algerian"/>
+          <w:spacing w:val="-6"/>
+          <w:sz w:val="33"/>
+        </w:rPr>
+        <w:tab/>
+        <w:t xml:space="preserve">      </w:t>
+      </w:r>
+      <w:r>
+        <w:rPr>
+          <w:rFonts w:ascii="Algerian"/>
+          <w:spacing w:val="-6"/>
+          <w:sz w:val="33"/>
+        </w:rPr>
+        <w:tab/>
+      </w:r>
+      <w:r>
+        <w:rPr>
+          <w:rFonts w:ascii="Algerian"/>
+          <w:spacing w:val="-6"/>
+          <w:sz w:val="33"/>
+        </w:rPr>
+        <w:t>PERIODO</w:t>
+      </w:r>
+      <w:r>
+        <w:rPr>
+          <w:rFonts w:ascii="Algerian"/>
+          <w:spacing w:val="-11"/>
+          <w:sz w:val="33"/>
+        </w:rPr>
+        <w:t xml:space="preserve"> </w:t>
+      </w:r>
+      <w:r>
+        <w:rPr>
+          <w:rFonts w:ascii="Algerian"/>
+          <w:spacing w:val="-2"/>
+          <w:sz w:val="33"/>
+        </w:rPr>
+        <w:t>ACADEMICO:</w:t>
+      </w:r>
+    </w:p>
+    <w:p>
+      <w:pPr>
+        <w:pStyle w:val="Ttulo"/>
+        <w:spacing w:line="276" w:lineRule="auto"/>
+        <w:ind w:left="2990" w:right="3348"/>
+        <w:jc w:val="center"/>
+      </w:pPr>
+      <w:r>
+        <w:rPr>
+          <w:color w:val="BE9000"/>
+        </w:rPr>
+        <w:t xml:space="preserve">   </w:t>
+      </w:r>
+      <w:r>
+        <w:rPr>
+          <w:color w:val="BE9000"/>
+        </w:rPr>
+        <w:t>septiembre</w:t>
+      </w:r>
+      <w:r>
+        <w:rPr>
+          <w:color w:val="BE9000"/>
+          <w:spacing w:val="-19"/>
+        </w:rPr>
+        <w:t xml:space="preserve"> </w:t>
+      </w:r>
+      <w:r>
+        <w:rPr>
+          <w:color w:val="BE9000"/>
+        </w:rPr>
+        <w:t>-</w:t>
+      </w:r>
+      <w:r>
+        <w:rPr>
+          <w:color w:val="BE9000"/>
+          <w:spacing w:val="-20"/>
+        </w:rPr>
+        <w:t xml:space="preserve"> </w:t>
+      </w:r>
+      <w:r>
+        <w:rPr>
+          <w:color w:val="BE9000"/>
+        </w:rPr>
+        <w:t xml:space="preserve">enero </w:t>
+      </w:r>
+      <w:r>
+        <w:rPr>
+          <w:color w:val="BE9000"/>
+        </w:rPr>
+        <w:t xml:space="preserve">        </w:t>
+      </w:r>
+      <w:r>
+        <w:t>2026 -2027</w:t>
+      </w:r>
+    </w:p>
+    <w:p>
+      <w:pPr>
+        <w:pStyle w:val="Ttulo"/>
+        <w:spacing w:line="276" w:lineRule="auto"/>
+        <w:sectPr>
+          <w:pgSz w:w="12240" w:h="15840"/>
+          <w:pgMar w:top="720" w:right="1080" w:bottom="280" w:left="1440" w:header="720" w:footer="720" w:gutter="0"/>
+          <w:cols w:space="720"/>
+        </w:sectPr>
+      </w:pPr>
+    </w:p>
+    <w:p/>
+    <w:p/>
+    <w:p/>
+    <w:p/>
+    <w:p/>
+    <w:p/>
+    <w:p/>
+    <w:p/>
+    <w:p/>
+    <w:p/>
+    <w:p/>
+    <w:p/>
+    <w:p/>
+    <w:p/>
+    <w:p/>
+    <w:p/>
+    <w:p/>
+    <w:p/>
+    <w:p/>
+    <w:p/>
+    <w:p/>
+    <w:p/>
+    <w:p/>
     <w:sectPr>
       <w:pgSz w:w="11906" w:h="16838"/>
       <w:pgMar w:top="1417" w:right="1701" w:bottom="1417" w:left="1701" w:header="708" w:footer="708" w:gutter="0"/>
@@ -142,7 +2260,7 @@
     <w:lsdException w:name="Closing" w:semiHidden="1" w:unhideWhenUsed="1"/>
     <w:lsdException w:name="Signature" w:semiHidden="1" w:unhideWhenUsed="1"/>
     <w:lsdException w:name="Default Paragraph Font" w:semiHidden="1" w:uiPriority="1" w:unhideWhenUsed="1"/>
-    <w:lsdException w:name="Body Text" w:semiHidden="1" w:unhideWhenUsed="1"/>
+    <w:lsdException w:name="Body Text" w:semiHidden="1" w:uiPriority="1" w:unhideWhenUsed="1" w:qFormat="1"/>
     <w:lsdException w:name="Body Text Indent" w:semiHidden="1" w:unhideWhenUsed="1"/>
     <w:lsdException w:name="List Continue" w:semiHidden="1" w:unhideWhenUsed="1"/>
     <w:lsdException w:name="List Continue 2" w:semiHidden="1" w:unhideWhenUsed="1"/>
@@ -484,6 +2602,90 @@
     <w:semiHidden/>
     <w:unhideWhenUsed/>
   </w:style>
+  <w:style w:type="paragraph" w:styleId="Textoindependiente">
+    <w:name w:val="Body Text"/>
+    <w:basedOn w:val="Normal"/>
+    <w:link w:val="TextoindependienteCar"/>
+    <w:uiPriority w:val="1"/>
+    <w:qFormat/>
+    <w:rsid w:val="002D0D3E"/>
+    <w:pPr>
+      <w:widowControl w:val="0"/>
+      <w:autoSpaceDE w:val="0"/>
+      <w:autoSpaceDN w:val="0"/>
+      <w:spacing w:after="0" w:line="240" w:lineRule="auto"/>
+      <w:jc w:val="both"/>
+    </w:pPr>
+    <w:rPr>
+      <w:rFonts w:ascii="Times New Roman" w:eastAsia="Times New Roman" w:hAnsi="Times New Roman" w:cs="Times New Roman"/>
+      <w:kern w:val="0"/>
+      <w:sz w:val="24"/>
+      <w:szCs w:val="24"/>
+      <w:lang w:val="es-ES"/>
+      <w14:ligatures w14:val="none"/>
+    </w:rPr>
+  </w:style>
+  <w:style w:type="character" w:customStyle="1" w:styleId="TextoindependienteCar">
+    <w:name w:val="Texto independiente Car"/>
+    <w:basedOn w:val="Fuentedeprrafopredeter"/>
+    <w:link w:val="Textoindependiente"/>
+    <w:uiPriority w:val="1"/>
+    <w:rsid w:val="002D0D3E"/>
+    <w:rPr>
+      <w:rFonts w:ascii="Times New Roman" w:eastAsia="Times New Roman" w:hAnsi="Times New Roman" w:cs="Times New Roman"/>
+      <w:kern w:val="0"/>
+      <w:sz w:val="24"/>
+      <w:szCs w:val="24"/>
+      <w:lang w:val="es-ES"/>
+      <w14:ligatures w14:val="none"/>
+    </w:rPr>
+  </w:style>
+  <w:style w:type="paragraph" w:styleId="Ttulo">
+    <w:name w:val="Title"/>
+    <w:basedOn w:val="Normal"/>
+    <w:link w:val="TtuloCar"/>
+    <w:uiPriority w:val="10"/>
+    <w:qFormat/>
+    <w:rsid w:val="002D0D3E"/>
+    <w:pPr>
+      <w:widowControl w:val="0"/>
+      <w:autoSpaceDE w:val="0"/>
+      <w:autoSpaceDN w:val="0"/>
+      <w:spacing w:before="222" w:after="0" w:line="240" w:lineRule="auto"/>
+      <w:ind w:left="1440"/>
+    </w:pPr>
+    <w:rPr>
+      <w:rFonts w:ascii="Times New Roman" w:eastAsia="Times New Roman" w:hAnsi="Times New Roman" w:cs="Times New Roman"/>
+      <w:b/>
+      <w:bCs/>
+      <w:i/>
+      <w:iCs/>
+      <w:kern w:val="0"/>
+      <w:sz w:val="36"/>
+      <w:szCs w:val="36"/>
+      <w:lang w:val="es-ES"/>
+      <w14:ligatures w14:val="none"/>
+    </w:rPr>
+  </w:style>
+  <w:style w:type="character" w:customStyle="1" w:styleId="TtuloCar">
+    <w:name w:val="Título Car"/>
+    <w:basedOn w:val="Fuentedeprrafopredeter"/>
+    <w:link w:val="Ttulo"/>
+    <w:uiPriority w:val="10"/>
+    <w:rsid w:val="002D0D3E"/>
+    <w:rPr>
+      <w:rFonts w:ascii="Times New Roman" w:eastAsia="Times New Roman" w:hAnsi="Times New Roman" w:cs="Times New Roman"/>
+      <w:b/>
+      <w:bCs/>
+      <w:i/>
+      <w:iCs/>
+      <w:kern w:val="0"/>
+      <w:sz w:val="36"/>
+      <w:szCs w:val="36"/>
+      <w:lang w:val="es-ES"/>
+      <w14:ligatures w14:val="none"/>
+    </w:rPr>
+  </w:style>
 </w:styles>
 </file>
 

</xml_diff>